<commit_message>
uj konzulens tanar dokumentumba atirva
</commit_message>
<xml_diff>
--- a/DOKUMENTUMOK/vizsgaremek_doku_minta.docx
+++ b/DOKUMENTUMOK/vizsgaremek_doku_minta.docx
@@ -74,7 +74,7 @@
         <w:t>Konzulens tanár:</w:t>
       </w:r>
       <w:r>
-        <w:t xml:space="preserve"> Ivanics Bálint</w:t>
+        <w:t xml:space="preserve"> Kovács Árpád</w:t>
       </w:r>
       <w:r>
         <w:tab/>
@@ -2131,15 +2131,7 @@
         <w:t>Adatbázis-kezelés</w:t>
       </w:r>
       <w:r>
-        <w:t xml:space="preserve">: </w:t>
-      </w:r>
-      <w:proofErr w:type="spellStart"/>
-      <w:r>
-        <w:t>MySQL</w:t>
-      </w:r>
-      <w:proofErr w:type="spellEnd"/>
-      <w:r>
-        <w:t xml:space="preserve"> – az örökbefogadási adatok tárolásához</w:t>
+        <w:t>: MySQL – az örökbefogadási adatok tárolásához</w:t>
       </w:r>
     </w:p>
     <w:p>
@@ -2163,23 +2155,7 @@
         <w:t>Fejlesztői eszközök</w:t>
       </w:r>
       <w:r>
-        <w:t xml:space="preserve">: Visual </w:t>
-      </w:r>
-      <w:proofErr w:type="spellStart"/>
-      <w:r>
-        <w:t>Studio</w:t>
-      </w:r>
-      <w:proofErr w:type="spellEnd"/>
-      <w:r>
-        <w:t xml:space="preserve"> </w:t>
-      </w:r>
-      <w:proofErr w:type="spellStart"/>
-      <w:r>
-        <w:t>Code</w:t>
-      </w:r>
-      <w:proofErr w:type="spellEnd"/>
-      <w:r>
-        <w:t>, GitHub – kódírás és verziókezelés</w:t>
+        <w:t>: Visual Studio Code, GitHub – kódírás és verziókezelés</w:t>
       </w:r>
     </w:p>
     <w:p>
@@ -2204,23 +2180,7 @@
         <w:t>Csapatmunka</w:t>
       </w:r>
       <w:r>
-        <w:t xml:space="preserve">: Microsoft </w:t>
-      </w:r>
-      <w:proofErr w:type="spellStart"/>
-      <w:r>
-        <w:t>Teams</w:t>
-      </w:r>
-      <w:proofErr w:type="spellEnd"/>
-      <w:r>
-        <w:t xml:space="preserve">, </w:t>
-      </w:r>
-      <w:proofErr w:type="spellStart"/>
-      <w:r>
-        <w:t>Discord</w:t>
-      </w:r>
-      <w:proofErr w:type="spellEnd"/>
-      <w:r>
-        <w:t xml:space="preserve"> – kommunikáció és projektmenedzsment</w:t>
+        <w:t>: Microsoft Teams, Discord – kommunikáció és projektmenedzsment</w:t>
       </w:r>
     </w:p>
     <w:p>
@@ -2268,15 +2228,7 @@
         <w:t>Szoftverfejlesztési módszertanok</w:t>
       </w:r>
       <w:r>
-        <w:t xml:space="preserve">: moduláris felépítés, </w:t>
-      </w:r>
-      <w:proofErr w:type="spellStart"/>
-      <w:r>
-        <w:t>kódkommentelés</w:t>
-      </w:r>
-      <w:proofErr w:type="spellEnd"/>
-      <w:r>
-        <w:t>, hibakezelés</w:t>
+        <w:t>: moduláris felépítés, kódkommentelés, hibakezelés</w:t>
       </w:r>
     </w:p>
     <w:p/>
@@ -2308,33 +2260,8 @@
           <w:rStyle w:val="Kiemels2"/>
           <w:rFonts w:eastAsiaTheme="majorEastAsia"/>
         </w:rPr>
-        <w:t xml:space="preserve">Visual </w:t>
-      </w:r>
-      <w:proofErr w:type="spellStart"/>
-      <w:r>
-        <w:rPr>
-          <w:rStyle w:val="Kiemels2"/>
-          <w:rFonts w:eastAsiaTheme="majorEastAsia"/>
-        </w:rPr>
-        <w:t>Studio</w:t>
-      </w:r>
-      <w:proofErr w:type="spellEnd"/>
-      <w:r>
-        <w:rPr>
-          <w:rStyle w:val="Kiemels2"/>
-          <w:rFonts w:eastAsiaTheme="majorEastAsia"/>
-        </w:rPr>
-        <w:t xml:space="preserve"> </w:t>
-      </w:r>
-      <w:proofErr w:type="spellStart"/>
-      <w:r>
-        <w:rPr>
-          <w:rStyle w:val="Kiemels2"/>
-          <w:rFonts w:eastAsiaTheme="majorEastAsia"/>
-        </w:rPr>
-        <w:t>Code</w:t>
-      </w:r>
-      <w:proofErr w:type="spellEnd"/>
+        <w:t>Visual Studio Code</w:t>
+      </w:r>
       <w:r>
         <w:t xml:space="preserve"> – fejlesztői környezet</w:t>
       </w:r>
@@ -2377,17 +2304,8 @@
           <w:rStyle w:val="Kiemels2"/>
           <w:rFonts w:eastAsiaTheme="majorEastAsia"/>
         </w:rPr>
-        <w:t xml:space="preserve">Microsoft </w:t>
-      </w:r>
-      <w:proofErr w:type="spellStart"/>
-      <w:r>
-        <w:rPr>
-          <w:rStyle w:val="Kiemels2"/>
-          <w:rFonts w:eastAsiaTheme="majorEastAsia"/>
-        </w:rPr>
-        <w:t>Teams</w:t>
-      </w:r>
-      <w:proofErr w:type="spellEnd"/>
+        <w:t>Microsoft Teams</w:t>
+      </w:r>
       <w:r>
         <w:t xml:space="preserve"> – csapatmunka és kommunikáció</w:t>
       </w:r>
@@ -2403,7 +2321,6 @@
       <w:r>
         <w:t xml:space="preserve"> </w:t>
       </w:r>
-      <w:proofErr w:type="spellStart"/>
       <w:r>
         <w:rPr>
           <w:rStyle w:val="Kiemels2"/>
@@ -2411,7 +2328,6 @@
         </w:rPr>
         <w:t>Discord</w:t>
       </w:r>
-      <w:proofErr w:type="spellEnd"/>
       <w:r>
         <w:t xml:space="preserve"> – közösségi és projektmegbeszélések</w:t>
       </w:r>
@@ -2643,23 +2559,7 @@
         </w:numPr>
       </w:pPr>
       <w:r>
-        <w:t xml:space="preserve"> Processzor: Intel </w:t>
-      </w:r>
-      <w:proofErr w:type="spellStart"/>
-      <w:r>
-        <w:t>Core</w:t>
-      </w:r>
-      <w:proofErr w:type="spellEnd"/>
-      <w:r>
-        <w:t xml:space="preserve"> i3 vagy AMD </w:t>
-      </w:r>
-      <w:proofErr w:type="spellStart"/>
-      <w:r>
-        <w:t>Ryzen</w:t>
-      </w:r>
-      <w:proofErr w:type="spellEnd"/>
-      <w:r>
-        <w:t xml:space="preserve"> 3</w:t>
+        <w:t xml:space="preserve"> Processzor: Intel Core i3 vagy AMD Ryzen 3</w:t>
       </w:r>
     </w:p>
     <w:p>
@@ -2695,15 +2595,7 @@
         </w:numPr>
       </w:pPr>
       <w:r>
-        <w:t xml:space="preserve"> Internet: Stabil kapcsolat (min. 5 </w:t>
-      </w:r>
-      <w:proofErr w:type="spellStart"/>
-      <w:r>
-        <w:t>Mbps</w:t>
-      </w:r>
-      <w:proofErr w:type="spellEnd"/>
-      <w:r>
-        <w:t>)</w:t>
+        <w:t xml:space="preserve"> Internet: Stabil kapcsolat (min. 5 Mbps)</w:t>
       </w:r>
     </w:p>
     <w:p>
@@ -2747,15 +2639,7 @@
         </w:numPr>
       </w:pPr>
       <w:r>
-        <w:t xml:space="preserve">Operációs rendszer: Windows 10/11, </w:t>
-      </w:r>
-      <w:proofErr w:type="spellStart"/>
-      <w:r>
-        <w:t>macOS</w:t>
-      </w:r>
-      <w:proofErr w:type="spellEnd"/>
-      <w:r>
-        <w:t>, Linux, Android, iOS</w:t>
+        <w:t>Operációs rendszer: Windows 10/11, macOS, Linux, Android, iOS</w:t>
       </w:r>
     </w:p>
     <w:p>
@@ -2767,15 +2651,7 @@
         </w:numPr>
       </w:pPr>
       <w:r>
-        <w:t xml:space="preserve">Böngésző: Chrome, Edge, Firefox vagy </w:t>
-      </w:r>
-      <w:proofErr w:type="spellStart"/>
-      <w:r>
-        <w:t>Safari</w:t>
-      </w:r>
-      <w:proofErr w:type="spellEnd"/>
-      <w:r>
-        <w:t xml:space="preserve"> (friss verzió)</w:t>
+        <w:t>Böngésző: Chrome, Edge, Firefox vagy Safari (friss verzió)</w:t>
       </w:r>
     </w:p>
     <w:p>
@@ -2787,13 +2663,8 @@
         </w:numPr>
       </w:pPr>
       <w:r>
-        <w:t xml:space="preserve">Adatbázis: </w:t>
-      </w:r>
-      <w:proofErr w:type="spellStart"/>
-      <w:r>
-        <w:t>MySQL</w:t>
-      </w:r>
-      <w:proofErr w:type="spellEnd"/>
+        <w:t>Adatbázis: MySQL</w:t>
+      </w:r>
     </w:p>
     <w:p>
       <w:pPr>
@@ -2804,15 +2675,7 @@
         </w:numPr>
       </w:pPr>
       <w:r>
-        <w:t xml:space="preserve">Kiegészítők: .NET (Windows), </w:t>
-      </w:r>
-      <w:proofErr w:type="spellStart"/>
-      <w:r>
-        <w:t>DirectX</w:t>
-      </w:r>
-      <w:proofErr w:type="spellEnd"/>
-      <w:r>
-        <w:t xml:space="preserve"> (Windows), SSL/TLS a biztonság miatt</w:t>
+        <w:t>Kiegészítők: .NET (Windows), DirectX (Windows), SSL/TLS a biztonság miatt</w:t>
       </w:r>
     </w:p>
     <w:p>
@@ -2881,21 +2744,7 @@
         <w:rPr>
           <w:color w:val="FF0000"/>
         </w:rPr>
-        <w:t xml:space="preserve">Módosító </w:t>
-      </w:r>
-      <w:proofErr w:type="gramStart"/>
-      <w:r>
-        <w:rPr>
-          <w:color w:val="FF0000"/>
-        </w:rPr>
-        <w:t>ablak(</w:t>
-      </w:r>
-      <w:proofErr w:type="gramEnd"/>
-      <w:r>
-        <w:rPr>
-          <w:color w:val="FF0000"/>
-        </w:rPr>
-        <w:t>1. kép)</w:t>
+        <w:t>Módosító ablak(1. kép)</w:t>
       </w:r>
     </w:p>
     <w:p>
@@ -3124,21 +2973,7 @@
         <w:rPr>
           <w:color w:val="FF0000"/>
         </w:rPr>
-        <w:t xml:space="preserve">Ugyanakkor kerüld a laza stílust: rövidítések, </w:t>
-      </w:r>
-      <w:proofErr w:type="spellStart"/>
-      <w:r>
-        <w:rPr>
-          <w:color w:val="FF0000"/>
-        </w:rPr>
-        <w:t>smilie</w:t>
-      </w:r>
-      <w:proofErr w:type="spellEnd"/>
-      <w:r>
-        <w:rPr>
-          <w:color w:val="FF0000"/>
-        </w:rPr>
-        <w:t>-k, szleng kizárva.</w:t>
+        <w:t>Ugyanakkor kerüld a laza stílust: rövidítések, smilie-k, szleng kizárva.</w:t>
       </w:r>
     </w:p>
     <w:p>
@@ -3157,35 +2992,7 @@
           <w:color w:val="FF0000"/>
         </w:rPr>
         <w:lastRenderedPageBreak/>
-        <w:t xml:space="preserve">Alkalmazz ábrákat, </w:t>
-      </w:r>
-      <w:proofErr w:type="spellStart"/>
-      <w:r>
-        <w:rPr>
-          <w:color w:val="FF0000"/>
-        </w:rPr>
-        <w:t>screenshot-</w:t>
-      </w:r>
-      <w:proofErr w:type="gramStart"/>
-      <w:r>
-        <w:rPr>
-          <w:color w:val="FF0000"/>
-        </w:rPr>
-        <w:t>okat</w:t>
-      </w:r>
-      <w:proofErr w:type="spellEnd"/>
-      <w:r>
-        <w:rPr>
-          <w:color w:val="FF0000"/>
-        </w:rPr>
-        <w:t xml:space="preserve"> ,</w:t>
-      </w:r>
-      <w:proofErr w:type="gramEnd"/>
-      <w:r>
-        <w:rPr>
-          <w:color w:val="FF0000"/>
-        </w:rPr>
-        <w:t xml:space="preserve"> de a ne legyen túlzott a képek aránya a szöveghez képest. Kb. 2-3 oldalanként egy ábra megfelelő. </w:t>
+        <w:t xml:space="preserve">Alkalmazz ábrákat, screenshot-okat , de a ne legyen túlzott a képek aránya a szöveghez képest. Kb. 2-3 oldalanként egy ábra megfelelő. </w:t>
       </w:r>
     </w:p>
     <w:p>
@@ -3231,15 +3038,7 @@
     </w:p>
     <w:p>
       <w:r>
-        <w:t xml:space="preserve">Fel kell sorolnod az összes olyan szoftver </w:t>
-      </w:r>
-      <w:proofErr w:type="gramStart"/>
-      <w:r>
-        <w:t>eszközt</w:t>
-      </w:r>
-      <w:proofErr w:type="gramEnd"/>
-      <w:r>
-        <w:t xml:space="preserve"> amelyet a program fejlesztéséhez, illetve a dokumentáció készítéséhez felhasználtál. (Pl. programozási nyelv, fejlesztői környezet, adatbázis-kezelő rendszer, kép-, szöveg-, zeneszerkesztő program stb.)</w:t>
+        <w:t>Fel kell sorolnod az összes olyan szoftver eszközt amelyet a program fejlesztéséhez, illetve a dokumentáció készítéséhez felhasználtál. (Pl. programozási nyelv, fejlesztői környezet, adatbázis-kezelő rendszer, kép-, szöveg-, zeneszerkesztő program stb.)</w:t>
       </w:r>
     </w:p>
     <w:p>
@@ -3354,25 +3153,7 @@
         <w:t xml:space="preserve">A program lényeges függvényeinek, az osztályok metódusainak a specifikációja (mit valósít meg az adott függvény, illetve metódus, milyen paraméterei vannak, mi a visszatérési érték) </w:t>
       </w:r>
       <w:r>
-        <w:t> Az algoritmizálható részek leírása valamilyen algoritmus-leíró eszközzel (</w:t>
-      </w:r>
-      <w:proofErr w:type="spellStart"/>
-      <w:proofErr w:type="gramStart"/>
-      <w:r>
-        <w:t>struktogram</w:t>
-      </w:r>
-      <w:proofErr w:type="spellEnd"/>
-      <w:r>
-        <w:t xml:space="preserve">,  </w:t>
-      </w:r>
-      <w:proofErr w:type="spellStart"/>
-      <w:r>
-        <w:t>pszeudo</w:t>
-      </w:r>
-      <w:proofErr w:type="spellEnd"/>
-      <w:proofErr w:type="gramEnd"/>
-      <w:r>
-        <w:t xml:space="preserve">-kód, esetleg UML aktivitás-diagram) Ajánlott terjedelem: a feladat jellegétől függően 2-5 oldal. 5. Forráskód </w:t>
+        <w:t xml:space="preserve"> Az algoritmizálható részek leírása valamilyen algoritmus-leíró eszközzel (struktogram,  pszeudo-kód, esetleg UML aktivitás-diagram) Ajánlott terjedelem: a feladat jellegétől függően 2-5 oldal. 5. Forráskód </w:t>
       </w:r>
       <w:r>
         <w:t xml:space="preserve"> A teljes forráskódot a </w:t>
@@ -3788,14 +3569,27 @@
     <w:pPr>
       <w:pStyle w:val="llb"/>
     </w:pPr>
-    <w:fldSimple w:instr=" DATE   \* MERGEFORMAT ">
-      <w:r>
-        <w:rPr>
-          <w:noProof/>
-        </w:rPr>
-        <w:t>2025. 11. 12.</w:t>
-      </w:r>
-    </w:fldSimple>
+    <w:r>
+      <w:fldChar w:fldCharType="begin"/>
+    </w:r>
+    <w:r>
+      <w:instrText xml:space="preserve"> DATE   \* MERGEFORMAT </w:instrText>
+    </w:r>
+    <w:r>
+      <w:fldChar w:fldCharType="separate"/>
+    </w:r>
+    <w:r>
+      <w:rPr>
+        <w:noProof/>
+      </w:rPr>
+      <w:t>2026. 02. 16.</w:t>
+    </w:r>
+    <w:r>
+      <w:rPr>
+        <w:noProof/>
+      </w:rPr>
+      <w:fldChar w:fldCharType="end"/>
+    </w:r>
     <w:r>
       <w:tab/>
     </w:r>
@@ -7392,6 +7186,25 @@
 </file>
 
 <file path=customXml/item1.xml><?xml version="1.0" encoding="utf-8"?>
+<b:Sources xmlns:b="http://schemas.openxmlformats.org/officeDocument/2006/bibliography" xmlns="http://schemas.openxmlformats.org/officeDocument/2006/bibliography" SelectedStyle="\APA.XSL" StyleName="APA"/>
+</file>
+
+<file path=customXml/item2.xml><?xml version="1.0" encoding="utf-8"?>
+<p:properties xmlns:p="http://schemas.microsoft.com/office/2006/metadata/properties" xmlns:xsi="http://www.w3.org/2001/XMLSchema-instance" xmlns:pc="http://schemas.microsoft.com/office/infopath/2007/PartnerControls">
+  <documentManagement/>
+</p:properties>
+</file>
+
+<file path=customXml/item3.xml><?xml version="1.0" encoding="utf-8"?>
+<?mso-contentType ?>
+<FormTemplates xmlns="http://schemas.microsoft.com/sharepoint/v3/contenttype/forms">
+  <Display>DocumentLibraryForm</Display>
+  <Edit>DocumentLibraryForm</Edit>
+  <New>DocumentLibraryForm</New>
+</FormTemplates>
+</file>
+
+<file path=customXml/item4.xml><?xml version="1.0" encoding="utf-8"?>
 <ct:contentTypeSchema xmlns:ct="http://schemas.microsoft.com/office/2006/metadata/contentType" xmlns:ma="http://schemas.microsoft.com/office/2006/metadata/properties/metaAttributes" ct:_="" ma:_="" ma:contentTypeName="Dokumentum" ma:contentTypeID="0x0101004AD40832F052A44985CF0BB7E4CC5CE6" ma:contentTypeVersion="3" ma:contentTypeDescription="Új dokumentum létrehozása." ma:contentTypeScope="" ma:versionID="4f645cc22e4e8a025bd08f7a284c6328">
   <xsd:schema xmlns:xsd="http://www.w3.org/2001/XMLSchema" xmlns:xs="http://www.w3.org/2001/XMLSchema" xmlns:p="http://schemas.microsoft.com/office/2006/metadata/properties" xmlns:ns2="61fcff8d-3f70-4849-8ae2-5fe1b28dc513" targetNamespace="http://schemas.microsoft.com/office/2006/metadata/properties" ma:root="true" ma:fieldsID="ce15b709a1860217d3b77958b410e9d8" ns2:_="">
     <xsd:import namespace="61fcff8d-3f70-4849-8ae2-5fe1b28dc513"/>
@@ -7529,26 +7342,32 @@
 </ct:contentTypeSchema>
 </file>
 
-<file path=customXml/item2.xml><?xml version="1.0" encoding="utf-8"?>
-<?mso-contentType ?>
-<FormTemplates xmlns="http://schemas.microsoft.com/sharepoint/v3/contenttype/forms">
-  <Display>DocumentLibraryForm</Display>
-  <Edit>DocumentLibraryForm</Edit>
-  <New>DocumentLibraryForm</New>
-</FormTemplates>
+<file path=customXml/itemProps1.xml><?xml version="1.0" encoding="utf-8"?>
+<ds:datastoreItem xmlns:ds="http://schemas.openxmlformats.org/officeDocument/2006/customXml" ds:itemID="{31D8A198-B5FD-41D1-8F98-20D226CAF475}">
+  <ds:schemaRefs>
+    <ds:schemaRef ds:uri="http://schemas.openxmlformats.org/officeDocument/2006/bibliography"/>
+  </ds:schemaRefs>
+</ds:datastoreItem>
 </file>
 
-<file path=customXml/item3.xml><?xml version="1.0" encoding="utf-8"?>
-<p:properties xmlns:p="http://schemas.microsoft.com/office/2006/metadata/properties" xmlns:xsi="http://www.w3.org/2001/XMLSchema-instance" xmlns:pc="http://schemas.microsoft.com/office/infopath/2007/PartnerControls">
-  <documentManagement/>
-</p:properties>
+<file path=customXml/itemProps2.xml><?xml version="1.0" encoding="utf-8"?>
+<ds:datastoreItem xmlns:ds="http://schemas.openxmlformats.org/officeDocument/2006/customXml" ds:itemID="{4683CF39-CBC1-469A-88EA-F31417A0D119}">
+  <ds:schemaRefs>
+    <ds:schemaRef ds:uri="http://schemas.microsoft.com/office/2006/metadata/properties"/>
+    <ds:schemaRef ds:uri="http://schemas.microsoft.com/office/infopath/2007/PartnerControls"/>
+  </ds:schemaRefs>
+</ds:datastoreItem>
 </file>
 
-<file path=customXml/item4.xml><?xml version="1.0" encoding="utf-8"?>
-<b:Sources xmlns:b="http://schemas.openxmlformats.org/officeDocument/2006/bibliography" xmlns="http://schemas.openxmlformats.org/officeDocument/2006/bibliography" SelectedStyle="\APA.XSL" StyleName="APA"/>
+<file path=customXml/itemProps3.xml><?xml version="1.0" encoding="utf-8"?>
+<ds:datastoreItem xmlns:ds="http://schemas.openxmlformats.org/officeDocument/2006/customXml" ds:itemID="{49E9CE2F-4863-430F-A73B-CD3063AB172E}">
+  <ds:schemaRefs>
+    <ds:schemaRef ds:uri="http://schemas.microsoft.com/sharepoint/v3/contenttype/forms"/>
+  </ds:schemaRefs>
+</ds:datastoreItem>
 </file>
 
-<file path=customXml/itemProps1.xml><?xml version="1.0" encoding="utf-8"?>
+<file path=customXml/itemProps4.xml><?xml version="1.0" encoding="utf-8"?>
 <ds:datastoreItem xmlns:ds="http://schemas.openxmlformats.org/officeDocument/2006/customXml" ds:itemID="{14969299-495B-4585-A759-CF6FCF6243D8}">
   <ds:schemaRefs>
     <ds:schemaRef ds:uri="http://schemas.microsoft.com/office/2006/metadata/contentType"/>
@@ -7564,29 +7383,4 @@
     <ds:schemaRef ds:uri="http://schemas.microsoft.com/internal/obd"/>
   </ds:schemaRefs>
 </ds:datastoreItem>
-</file>
-
-<file path=customXml/itemProps2.xml><?xml version="1.0" encoding="utf-8"?>
-<ds:datastoreItem xmlns:ds="http://schemas.openxmlformats.org/officeDocument/2006/customXml" ds:itemID="{49E9CE2F-4863-430F-A73B-CD3063AB172E}">
-  <ds:schemaRefs>
-    <ds:schemaRef ds:uri="http://schemas.microsoft.com/sharepoint/v3/contenttype/forms"/>
-  </ds:schemaRefs>
-</ds:datastoreItem>
-</file>
-
-<file path=customXml/itemProps3.xml><?xml version="1.0" encoding="utf-8"?>
-<ds:datastoreItem xmlns:ds="http://schemas.openxmlformats.org/officeDocument/2006/customXml" ds:itemID="{4683CF39-CBC1-469A-88EA-F31417A0D119}">
-  <ds:schemaRefs>
-    <ds:schemaRef ds:uri="http://schemas.microsoft.com/office/2006/metadata/properties"/>
-    <ds:schemaRef ds:uri="http://schemas.microsoft.com/office/infopath/2007/PartnerControls"/>
-  </ds:schemaRefs>
-</ds:datastoreItem>
-</file>
-
-<file path=customXml/itemProps4.xml><?xml version="1.0" encoding="utf-8"?>
-<ds:datastoreItem xmlns:ds="http://schemas.openxmlformats.org/officeDocument/2006/customXml" ds:itemID="{31D8A198-B5FD-41D1-8F98-20D226CAF475}">
-  <ds:schemaRefs>
-    <ds:schemaRef ds:uri="http://schemas.openxmlformats.org/officeDocument/2006/bibliography"/>
-  </ds:schemaRefs>
-</ds:datastoreItem>
 </file>
</xml_diff>